<commit_message>
feat(resistividade): adicionar campos de imagem e assinatura ao templateData
Adiciona foto_geral_imagem, croqui, croqui_imagem, fotos_memorial, mapa e
resp_assinatura ao templateData para que o template renderize corretamente
os placeholders de imagem.

Co-Authored-By: Claude Sonnet 4.6 <noreply@anthropic.com>
</commit_message>
<xml_diff>
--- a/public/modelo_resistividade.docx
+++ b/public/modelo_resistividade.docx
@@ -2216,18 +2216,9 @@
         </w:rPr>
         <w:t>Indicação dos elementos ensaiados</w:t>
       </w:r>
-    </w:p>
-    <w:p>
-      <w:pPr>
-        <w:rPr>
-          <w:rFonts w:asciiTheme="minorHAnsi" w:hAnsiTheme="minorHAnsi" w:cstheme="minorHAnsi"/>
-          <w:lang w:eastAsia="pt-BR"/>
-        </w:rPr>
-      </w:pPr>
-      <w:r>
-        <w:rPr>
-          <w:rFonts w:asciiTheme="minorHAnsi" w:hAnsiTheme="minorHAnsi" w:cstheme="minorHAnsi"/>
-          <w:lang w:eastAsia="pt-BR"/>
+      <w:r>
+        <w:rPr>
+          <w:rFonts w:asciiTheme="minorHAnsi" w:hAnsiTheme="minorHAnsi" w:cstheme="minorHAnsi"/>
         </w:rPr>
         <w:t>[[/croqui]]</w:t>
       </w:r>
@@ -4254,7 +4245,7 @@
     <mc:AlternateContent>
       <mc:Choice Requires="v">
         <w:pict>
-          <v:shapetype w14:anchorId="38B12487" id="_x0000_t75" coordsize="21600,21600" o:spt="75" o:preferrelative="t" path="m@4@5l@4@11@9@11@9@5xe" filled="f" stroked="f">
+          <v:shapetype w14:anchorId="0A0EF519" id="_x0000_t75" coordsize="21600,21600" o:spt="75" o:preferrelative="t" path="m@4@5l@4@11@9@11@9@5xe" filled="f" stroked="f">
             <v:stroke joinstyle="miter"/>
             <v:formulas>
               <v:f eqn="if lineDrawn pixelLineWidth 0"/>
@@ -4273,17 +4264,17 @@
             <v:path o:extrusionok="f" gradientshapeok="t" o:connecttype="rect"/>
             <o:lock v:ext="edit" aspectratio="t"/>
           </v:shapetype>
-          <v:shape id="Imagem 1096429683" o:spid="_x0000_i1025" type="#_x0000_t75" style="width:189.15pt;height:195.6pt;visibility:visible;mso-wrap-style:square">
+          <v:shape id="Imagem 1538604798" o:spid="_x0000_i1025" type="#_x0000_t75" style="width:189.15pt;height:195.6pt;visibility:visible;mso-wrap-style:square">
             <v:imagedata r:id="rId1" o:title=""/>
           </v:shape>
         </w:pict>
       </mc:Choice>
       <mc:Fallback>
         <w:drawing>
-          <wp:inline distT="0" distB="0" distL="0" distR="0" wp14:anchorId="07143848" wp14:editId="2DBFE345">
+          <wp:inline distT="0" distB="0" distL="0" distR="0" wp14:anchorId="6AAC1179" wp14:editId="662741AC">
             <wp:extent cx="2402205" cy="2484120"/>
             <wp:effectExtent l="0" t="0" r="0" b="0"/>
-            <wp:docPr id="1096429683" name="Imagem 1096429683"/>
+            <wp:docPr id="1538604798" name="Imagem 1538604798"/>
             <wp:cNvGraphicFramePr>
               <a:graphicFrameLocks xmlns:a="http://schemas.openxmlformats.org/drawingml/2006/main" noChangeAspect="1"/>
             </wp:cNvGraphicFramePr>

</xml_diff>

<commit_message>
fix: evitar quebra de página na Tabela 1 de resistividade
</commit_message>
<xml_diff>
--- a/public/modelo_resistividade.docx
+++ b/public/modelo_resistividade.docx
@@ -465,14 +465,7 @@
                 <w:rFonts w:asciiTheme="minorHAnsi" w:hAnsiTheme="minorHAnsi"/>
                 <w:color w:val="0F243E" w:themeColor="text2" w:themeShade="80"/>
               </w:rPr>
-              <w:t xml:space="preserve">OBRA: </w:t>
-            </w:r>
-            <w:r>
-              <w:rPr>
-                <w:rFonts w:asciiTheme="minorHAnsi" w:hAnsiTheme="minorHAnsi"/>
-                <w:color w:val="0F243E" w:themeColor="text2" w:themeShade="80"/>
-              </w:rPr>
-              <w:t>[[obra_intro]]</w:t>
+              <w:t>OBRA: [[obra_intro]]</w:t>
             </w:r>
           </w:p>
           <w:p>
@@ -503,14 +496,7 @@
                 <w:rFonts w:asciiTheme="minorHAnsi" w:hAnsiTheme="minorHAnsi"/>
                 <w:color w:val="0F243E" w:themeColor="text2" w:themeShade="80"/>
               </w:rPr>
-              <w:t xml:space="preserve">ENDEREÇO: </w:t>
-            </w:r>
-            <w:r>
-              <w:rPr>
-                <w:rFonts w:asciiTheme="minorHAnsi" w:hAnsiTheme="minorHAnsi"/>
-                <w:color w:val="0F243E" w:themeColor="text2" w:themeShade="80"/>
-              </w:rPr>
-              <w:t>[[endereco_intro]]</w:t>
+              <w:t>ENDEREÇO: [[endereco_intro]]</w:t>
             </w:r>
           </w:p>
         </w:tc>
@@ -638,17 +624,7 @@
           <w:rFonts w:asciiTheme="minorHAnsi" w:hAnsiTheme="minorHAnsi" w:cstheme="minorHAnsi"/>
         </w:rPr>
         <w:fldChar w:fldCharType="begin"/>
-      </w:r>
-      <w:r>
-        <w:rPr>
-          <w:rFonts w:asciiTheme="minorHAnsi" w:hAnsiTheme="minorHAnsi" w:cstheme="minorHAnsi"/>
-        </w:rPr>
         <w:instrText xml:space="preserve"> TOC \o "1-3" \u </w:instrText>
-      </w:r>
-      <w:r>
-        <w:rPr>
-          <w:rFonts w:asciiTheme="minorHAnsi" w:hAnsiTheme="minorHAnsi" w:cstheme="minorHAnsi"/>
-        </w:rPr>
         <w:fldChar w:fldCharType="separate"/>
       </w:r>
       <w:r>
@@ -685,40 +661,10 @@
           <w:noProof/>
         </w:rPr>
         <w:tab/>
-      </w:r>
-      <w:r>
-        <w:rPr>
-          <w:noProof/>
-        </w:rPr>
         <w:fldChar w:fldCharType="begin"/>
-      </w:r>
-      <w:r>
-        <w:rPr>
-          <w:noProof/>
-        </w:rPr>
         <w:instrText xml:space="preserve"> PAGEREF _Toc229748475 \h </w:instrText>
-      </w:r>
-      <w:r>
-        <w:rPr>
-          <w:noProof/>
-        </w:rPr>
-      </w:r>
-      <w:r>
-        <w:rPr>
-          <w:noProof/>
-        </w:rPr>
         <w:fldChar w:fldCharType="separate"/>
-      </w:r>
-      <w:r>
-        <w:rPr>
-          <w:noProof/>
-        </w:rPr>
         <w:t>3</w:t>
-      </w:r>
-      <w:r>
-        <w:rPr>
-          <w:noProof/>
-        </w:rPr>
         <w:fldChar w:fldCharType="end"/>
       </w:r>
     </w:p>
@@ -776,40 +722,10 @@
           <w:noProof/>
         </w:rPr>
         <w:tab/>
-      </w:r>
-      <w:r>
-        <w:rPr>
-          <w:noProof/>
-        </w:rPr>
         <w:fldChar w:fldCharType="begin"/>
-      </w:r>
-      <w:r>
-        <w:rPr>
-          <w:noProof/>
-        </w:rPr>
         <w:instrText xml:space="preserve"> PAGEREF _Toc229748476 \h </w:instrText>
-      </w:r>
-      <w:r>
-        <w:rPr>
-          <w:noProof/>
-        </w:rPr>
-      </w:r>
-      <w:r>
-        <w:rPr>
-          <w:noProof/>
-        </w:rPr>
         <w:fldChar w:fldCharType="separate"/>
-      </w:r>
-      <w:r>
-        <w:rPr>
-          <w:noProof/>
-        </w:rPr>
         <w:t>3</w:t>
-      </w:r>
-      <w:r>
-        <w:rPr>
-          <w:noProof/>
-        </w:rPr>
         <w:fldChar w:fldCharType="end"/>
       </w:r>
     </w:p>
@@ -867,40 +783,10 @@
           <w:noProof/>
         </w:rPr>
         <w:tab/>
-      </w:r>
-      <w:r>
-        <w:rPr>
-          <w:noProof/>
-        </w:rPr>
         <w:fldChar w:fldCharType="begin"/>
-      </w:r>
-      <w:r>
-        <w:rPr>
-          <w:noProof/>
-        </w:rPr>
         <w:instrText xml:space="preserve"> PAGEREF _Toc229748477 \h </w:instrText>
-      </w:r>
-      <w:r>
-        <w:rPr>
-          <w:noProof/>
-        </w:rPr>
-      </w:r>
-      <w:r>
-        <w:rPr>
-          <w:noProof/>
-        </w:rPr>
         <w:fldChar w:fldCharType="separate"/>
-      </w:r>
-      <w:r>
-        <w:rPr>
-          <w:noProof/>
-        </w:rPr>
         <w:t>4</w:t>
-      </w:r>
-      <w:r>
-        <w:rPr>
-          <w:noProof/>
-        </w:rPr>
         <w:fldChar w:fldCharType="end"/>
       </w:r>
     </w:p>
@@ -958,40 +844,10 @@
           <w:noProof/>
         </w:rPr>
         <w:tab/>
-      </w:r>
-      <w:r>
-        <w:rPr>
-          <w:noProof/>
-        </w:rPr>
         <w:fldChar w:fldCharType="begin"/>
-      </w:r>
-      <w:r>
-        <w:rPr>
-          <w:noProof/>
-        </w:rPr>
         <w:instrText xml:space="preserve"> PAGEREF _Toc229748478 \h </w:instrText>
-      </w:r>
-      <w:r>
-        <w:rPr>
-          <w:noProof/>
-        </w:rPr>
-      </w:r>
-      <w:r>
-        <w:rPr>
-          <w:noProof/>
-        </w:rPr>
         <w:fldChar w:fldCharType="separate"/>
-      </w:r>
-      <w:r>
-        <w:rPr>
-          <w:noProof/>
-        </w:rPr>
         <w:t>4</w:t>
-      </w:r>
-      <w:r>
-        <w:rPr>
-          <w:noProof/>
-        </w:rPr>
         <w:fldChar w:fldCharType="end"/>
       </w:r>
     </w:p>
@@ -1049,40 +905,10 @@
           <w:noProof/>
         </w:rPr>
         <w:tab/>
-      </w:r>
-      <w:r>
-        <w:rPr>
-          <w:noProof/>
-        </w:rPr>
         <w:fldChar w:fldCharType="begin"/>
-      </w:r>
-      <w:r>
-        <w:rPr>
-          <w:noProof/>
-        </w:rPr>
         <w:instrText xml:space="preserve"> PAGEREF _Toc229748479 \h </w:instrText>
-      </w:r>
-      <w:r>
-        <w:rPr>
-          <w:noProof/>
-        </w:rPr>
-      </w:r>
-      <w:r>
-        <w:rPr>
-          <w:noProof/>
-        </w:rPr>
         <w:fldChar w:fldCharType="separate"/>
-      </w:r>
-      <w:r>
-        <w:rPr>
-          <w:noProof/>
-        </w:rPr>
         <w:t>5</w:t>
-      </w:r>
-      <w:r>
-        <w:rPr>
-          <w:noProof/>
-        </w:rPr>
         <w:fldChar w:fldCharType="end"/>
       </w:r>
     </w:p>
@@ -1140,40 +966,10 @@
           <w:noProof/>
         </w:rPr>
         <w:tab/>
-      </w:r>
-      <w:r>
-        <w:rPr>
-          <w:noProof/>
-        </w:rPr>
         <w:fldChar w:fldCharType="begin"/>
-      </w:r>
-      <w:r>
-        <w:rPr>
-          <w:noProof/>
-        </w:rPr>
         <w:instrText xml:space="preserve"> PAGEREF _Toc229748480 \h </w:instrText>
-      </w:r>
-      <w:r>
-        <w:rPr>
-          <w:noProof/>
-        </w:rPr>
-      </w:r>
-      <w:r>
-        <w:rPr>
-          <w:noProof/>
-        </w:rPr>
         <w:fldChar w:fldCharType="separate"/>
-      </w:r>
-      <w:r>
-        <w:rPr>
-          <w:noProof/>
-        </w:rPr>
         <w:t>5</w:t>
-      </w:r>
-      <w:r>
-        <w:rPr>
-          <w:noProof/>
-        </w:rPr>
         <w:fldChar w:fldCharType="end"/>
       </w:r>
     </w:p>
@@ -1231,40 +1027,10 @@
           <w:noProof/>
         </w:rPr>
         <w:tab/>
-      </w:r>
-      <w:r>
-        <w:rPr>
-          <w:noProof/>
-        </w:rPr>
         <w:fldChar w:fldCharType="begin"/>
-      </w:r>
-      <w:r>
-        <w:rPr>
-          <w:noProof/>
-        </w:rPr>
         <w:instrText xml:space="preserve"> PAGEREF _Toc229748481 \h </w:instrText>
-      </w:r>
-      <w:r>
-        <w:rPr>
-          <w:noProof/>
-        </w:rPr>
-      </w:r>
-      <w:r>
-        <w:rPr>
-          <w:noProof/>
-        </w:rPr>
         <w:fldChar w:fldCharType="separate"/>
-      </w:r>
-      <w:r>
-        <w:rPr>
-          <w:noProof/>
-        </w:rPr>
         <w:t>5</w:t>
-      </w:r>
-      <w:r>
-        <w:rPr>
-          <w:noProof/>
-        </w:rPr>
         <w:fldChar w:fldCharType="end"/>
       </w:r>
     </w:p>
@@ -1353,25 +1119,7 @@
         <w:rPr>
           <w:rFonts w:asciiTheme="minorHAnsi" w:hAnsiTheme="minorHAnsi" w:cstheme="minorHAnsi"/>
         </w:rPr>
-        <w:t xml:space="preserve">O presente relatório trata dos resultados do ensaio de </w:t>
-      </w:r>
-      <w:r>
-        <w:rPr>
-          <w:rFonts w:asciiTheme="minorHAnsi" w:hAnsiTheme="minorHAnsi" w:cstheme="minorHAnsi"/>
-        </w:rPr>
-        <w:t>resistividade elétrica</w:t>
-      </w:r>
-      <w:r>
-        <w:rPr>
-          <w:rFonts w:asciiTheme="minorHAnsi" w:hAnsiTheme="minorHAnsi" w:cstheme="minorHAnsi"/>
-        </w:rPr>
-        <w:t xml:space="preserve"> realizado em elementos de concreto armado da estrutura </w:t>
-      </w:r>
-      <w:r>
-        <w:rPr>
-          <w:rFonts w:asciiTheme="minorHAnsi" w:hAnsiTheme="minorHAnsi" w:cstheme="minorHAnsi"/>
-        </w:rPr>
-        <w:t xml:space="preserve">da obra </w:t>
+        <w:t xml:space="preserve">O presente relatório trata dos resultados do ensaio de resistividade elétrica realizado em elementos de concreto armado da estrutura da obra </w:t>
       </w:r>
       <w:r>
         <w:rPr>
@@ -1384,13 +1132,7 @@
         <w:rPr>
           <w:rFonts w:asciiTheme="minorHAnsi" w:hAnsiTheme="minorHAnsi" w:cstheme="minorHAnsi"/>
         </w:rPr>
-        <w:t>.</w:t>
-      </w:r>
-      <w:r>
-        <w:rPr>
-          <w:rFonts w:asciiTheme="minorHAnsi" w:hAnsiTheme="minorHAnsi" w:cstheme="minorHAnsi"/>
-        </w:rPr>
-        <w:t xml:space="preserve"> A avaliação, “</w:t>
+        <w:t>. A avaliação, “</w:t>
       </w:r>
       <w:r>
         <w:rPr>
@@ -1419,47 +1161,10 @@
         <w:rPr>
           <w:rFonts w:asciiTheme="minorHAnsi" w:hAnsiTheme="minorHAnsi" w:cstheme="minorHAnsi"/>
         </w:rPr>
-        <w:t xml:space="preserve">O empreendimento fica localizado na </w:t>
-      </w:r>
-      <w:r>
-        <w:rPr>
-          <w:rFonts w:asciiTheme="minorHAnsi" w:hAnsiTheme="minorHAnsi" w:cstheme="minorHAnsi"/>
-        </w:rPr>
-        <w:t>[[endereco]]</w:t>
-      </w:r>
-      <w:r>
-        <w:rPr>
-          <w:rFonts w:asciiTheme="minorHAnsi" w:hAnsiTheme="minorHAnsi" w:cstheme="minorHAnsi"/>
-        </w:rPr>
-        <w:t xml:space="preserve">, como observado na </w:t>
-      </w:r>
-      <w:r>
-        <w:rPr>
-          <w:rFonts w:asciiTheme="minorHAnsi" w:hAnsiTheme="minorHAnsi" w:cstheme="minorHAnsi"/>
-        </w:rPr>
+        <w:t xml:space="preserve">O empreendimento fica localizado na [[endereco]], como observado na </w:t>
         <w:fldChar w:fldCharType="begin"/>
-      </w:r>
-      <w:r>
-        <w:rPr>
-          <w:rFonts w:asciiTheme="minorHAnsi" w:hAnsiTheme="minorHAnsi" w:cstheme="minorHAnsi"/>
-        </w:rPr>
         <w:instrText xml:space="preserve"> REF _Ref229497795 \h </w:instrText>
-      </w:r>
-      <w:r>
-        <w:rPr>
-          <w:rFonts w:asciiTheme="minorHAnsi" w:hAnsiTheme="minorHAnsi" w:cstheme="minorHAnsi"/>
-        </w:rPr>
-      </w:r>
-      <w:r>
-        <w:rPr>
-          <w:rFonts w:asciiTheme="minorHAnsi" w:hAnsiTheme="minorHAnsi" w:cstheme="minorHAnsi"/>
-        </w:rPr>
         <w:fldChar w:fldCharType="separate"/>
-      </w:r>
-      <w:r>
-        <w:rPr>
-          <w:rFonts w:asciiTheme="minorHAnsi" w:hAnsiTheme="minorHAnsi" w:cstheme="minorHAnsi"/>
-        </w:rPr>
         <w:t xml:space="preserve">Figura </w:t>
       </w:r>
       <w:r>
@@ -1474,11 +1179,6 @@
           <w:rFonts w:asciiTheme="minorHAnsi" w:hAnsiTheme="minorHAnsi" w:cstheme="minorHAnsi"/>
         </w:rPr>
         <w:fldChar w:fldCharType="end"/>
-      </w:r>
-      <w:r>
-        <w:rPr>
-          <w:rFonts w:asciiTheme="minorHAnsi" w:hAnsiTheme="minorHAnsi" w:cstheme="minorHAnsi"/>
-        </w:rPr>
         <w:t>.</w:t>
       </w:r>
     </w:p>
@@ -1511,23 +1211,8 @@
           <w:rFonts w:asciiTheme="minorHAnsi" w:hAnsiTheme="minorHAnsi" w:cstheme="minorHAnsi"/>
         </w:rPr>
         <w:t xml:space="preserve">Figura </w:t>
-      </w:r>
-      <w:r>
-        <w:rPr>
-          <w:rFonts w:asciiTheme="minorHAnsi" w:hAnsiTheme="minorHAnsi" w:cstheme="minorHAnsi"/>
-        </w:rPr>
         <w:fldChar w:fldCharType="begin"/>
-      </w:r>
-      <w:r>
-        <w:rPr>
-          <w:rFonts w:asciiTheme="minorHAnsi" w:hAnsiTheme="minorHAnsi" w:cstheme="minorHAnsi"/>
-        </w:rPr>
         <w:instrText xml:space="preserve"> SEQ Figura \* ARABIC </w:instrText>
-      </w:r>
-      <w:r>
-        <w:rPr>
-          <w:rFonts w:asciiTheme="minorHAnsi" w:hAnsiTheme="minorHAnsi" w:cstheme="minorHAnsi"/>
-        </w:rPr>
         <w:fldChar w:fldCharType="separate"/>
       </w:r>
       <w:r>
@@ -1548,25 +1233,7 @@
         <w:rPr>
           <w:rFonts w:asciiTheme="minorHAnsi" w:hAnsiTheme="minorHAnsi" w:cstheme="minorHAnsi"/>
         </w:rPr>
-        <w:t xml:space="preserve"> </w:t>
-      </w:r>
-      <w:r>
-        <w:rPr>
-          <w:rFonts w:asciiTheme="minorHAnsi" w:hAnsiTheme="minorHAnsi" w:cstheme="minorHAnsi"/>
-        </w:rPr>
-        <w:t>–</w:t>
-      </w:r>
-      <w:r>
-        <w:rPr>
-          <w:rFonts w:asciiTheme="minorHAnsi" w:hAnsiTheme="minorHAnsi" w:cstheme="minorHAnsi"/>
-        </w:rPr>
-        <w:t xml:space="preserve"> </w:t>
-      </w:r>
-      <w:r>
-        <w:rPr>
-          <w:rFonts w:asciiTheme="minorHAnsi" w:hAnsiTheme="minorHAnsi" w:cstheme="minorHAnsi"/>
-        </w:rPr>
-        <w:t>Localização do empreendimento. Fonte: Google Earth, 2026</w:t>
+        <w:t xml:space="preserve"> – Localização do empreendimento. Fonte: Google Earth, 2026</w:t>
       </w:r>
     </w:p>
     <w:p>
@@ -1658,23 +1325,8 @@
           <w:rFonts w:asciiTheme="minorHAnsi" w:hAnsiTheme="minorHAnsi" w:cstheme="minorHAnsi"/>
         </w:rPr>
         <w:t xml:space="preserve">Figura </w:t>
-      </w:r>
-      <w:r>
-        <w:rPr>
-          <w:rFonts w:asciiTheme="minorHAnsi" w:hAnsiTheme="minorHAnsi" w:cstheme="minorHAnsi"/>
-        </w:rPr>
         <w:fldChar w:fldCharType="begin"/>
-      </w:r>
-      <w:r>
-        <w:rPr>
-          <w:rFonts w:asciiTheme="minorHAnsi" w:hAnsiTheme="minorHAnsi" w:cstheme="minorHAnsi"/>
-        </w:rPr>
         <w:instrText xml:space="preserve"> SEQ Figura \* ARABIC </w:instrText>
-      </w:r>
-      <w:r>
-        <w:rPr>
-          <w:rFonts w:asciiTheme="minorHAnsi" w:hAnsiTheme="minorHAnsi" w:cstheme="minorHAnsi"/>
-        </w:rPr>
         <w:fldChar w:fldCharType="separate"/>
       </w:r>
       <w:r>
@@ -1689,30 +1341,7 @@
           <w:rFonts w:asciiTheme="minorHAnsi" w:hAnsiTheme="minorHAnsi" w:cstheme="minorHAnsi"/>
         </w:rPr>
         <w:fldChar w:fldCharType="end"/>
-      </w:r>
-      <w:r>
-        <w:rPr>
-          <w:rFonts w:asciiTheme="minorHAnsi" w:hAnsiTheme="minorHAnsi" w:cstheme="minorHAnsi"/>
-        </w:rPr>
-        <w:t xml:space="preserve"> </w:t>
-      </w:r>
-      <w:r>
-        <w:rPr>
-          <w:rFonts w:asciiTheme="minorHAnsi" w:hAnsiTheme="minorHAnsi" w:cstheme="minorHAnsi"/>
-        </w:rPr>
-        <w:t>–</w:t>
-      </w:r>
-      <w:r>
-        <w:rPr>
-          <w:rFonts w:asciiTheme="minorHAnsi" w:hAnsiTheme="minorHAnsi" w:cstheme="minorHAnsi"/>
-        </w:rPr>
-        <w:t xml:space="preserve"> </w:t>
-      </w:r>
-      <w:r>
-        <w:rPr>
-          <w:rFonts w:asciiTheme="minorHAnsi" w:hAnsiTheme="minorHAnsi" w:cstheme="minorHAnsi"/>
-        </w:rPr>
-        <w:t>Vista geral da estrutura ensaiada</w:t>
+        <w:t xml:space="preserve"> – Vista geral da estrutura ensaiada</w:t>
       </w:r>
     </w:p>
     <w:p>
@@ -1764,59 +1393,10 @@
         <w:rPr>
           <w:rFonts w:asciiTheme="minorHAnsi" w:hAnsiTheme="minorHAnsi" w:cstheme="minorHAnsi"/>
         </w:rPr>
-        <w:t xml:space="preserve">O procedimento de medida da resistividade superficial do concreto é o método dos quatro eletrodos, com o equipamento resipod da marca Proceq, </w:t>
-      </w:r>
-      <w:r>
-        <w:rPr>
-          <w:rFonts w:asciiTheme="minorHAnsi" w:hAnsiTheme="minorHAnsi" w:cstheme="minorHAnsi"/>
-        </w:rPr>
-        <w:t>em conformidade com o padrão AASHTO T358, com ampla faixa de medição, 0 a apróximadamente 1000 k</w:t>
-      </w:r>
-      <w:r>
-        <w:rPr>
-          <w:rFonts w:asciiTheme="minorHAnsi" w:hAnsiTheme="minorHAnsi" w:cstheme="minorHAnsi"/>
-        </w:rPr>
-        <w:t>Ωcm</w:t>
-      </w:r>
-      <w:r>
-        <w:rPr>
-          <w:rFonts w:asciiTheme="minorHAnsi" w:hAnsiTheme="minorHAnsi" w:cstheme="minorHAnsi"/>
-        </w:rPr>
-        <w:t xml:space="preserve">, com conexão USB e software especializado para computador, </w:t>
-      </w:r>
-      <w:r>
-        <w:rPr>
-          <w:rFonts w:asciiTheme="minorHAnsi" w:hAnsiTheme="minorHAnsi" w:cstheme="minorHAnsi"/>
-        </w:rPr>
-        <w:t xml:space="preserve">como pode ser visto na </w:t>
-      </w:r>
-      <w:r>
-        <w:rPr>
-          <w:rFonts w:asciiTheme="minorHAnsi" w:hAnsiTheme="minorHAnsi" w:cstheme="minorHAnsi"/>
-        </w:rPr>
+        <w:t xml:space="preserve">O procedimento de medida da resistividade superficial do concreto é o método dos quatro eletrodos, com o equipamento resipod da marca Proceq, em conformidade com o padrão AASHTO T358, com ampla faixa de medição, 0 a apróximadamente 1000 kΩcm, com conexão USB e software especializado para computador, como pode ser visto na </w:t>
         <w:fldChar w:fldCharType="begin"/>
-      </w:r>
-      <w:r>
-        <w:rPr>
-          <w:rFonts w:asciiTheme="minorHAnsi" w:hAnsiTheme="minorHAnsi" w:cstheme="minorHAnsi"/>
-        </w:rPr>
         <w:instrText xml:space="preserve"> REF _Ref229748346 \h </w:instrText>
-      </w:r>
-      <w:r>
-        <w:rPr>
-          <w:rFonts w:asciiTheme="minorHAnsi" w:hAnsiTheme="minorHAnsi" w:cstheme="minorHAnsi"/>
-        </w:rPr>
-      </w:r>
-      <w:r>
-        <w:rPr>
-          <w:rFonts w:asciiTheme="minorHAnsi" w:hAnsiTheme="minorHAnsi" w:cstheme="minorHAnsi"/>
-        </w:rPr>
         <w:fldChar w:fldCharType="separate"/>
-      </w:r>
-      <w:r>
-        <w:rPr>
-          <w:rFonts w:asciiTheme="minorHAnsi" w:hAnsiTheme="minorHAnsi" w:cstheme="minorHAnsi"/>
-        </w:rPr>
         <w:t xml:space="preserve">Figura </w:t>
       </w:r>
       <w:r>
@@ -1831,11 +1411,6 @@
           <w:rFonts w:asciiTheme="minorHAnsi" w:hAnsiTheme="minorHAnsi" w:cstheme="minorHAnsi"/>
         </w:rPr>
         <w:fldChar w:fldCharType="end"/>
-      </w:r>
-      <w:r>
-        <w:rPr>
-          <w:rFonts w:asciiTheme="minorHAnsi" w:hAnsiTheme="minorHAnsi" w:cstheme="minorHAnsi"/>
-        </w:rPr>
         <w:t xml:space="preserve"> abaixo.</w:t>
       </w:r>
     </w:p>
@@ -1855,7 +1430,7 @@
           <wp:inline distT="0" distB="0" distL="0" distR="0" wp14:anchorId="311F0C9F" wp14:editId="70155762">
             <wp:extent cx="2552700" cy="1956449"/>
             <wp:effectExtent l="0" t="0" r="0" b="5715"/>
-            <wp:docPr id="3" name="Imagem 1" descr="Diagrama&#10;&#10;O conteúdo gerado por IA pode estar incorreto.">
+            <wp:docPr id="3" name="Imagem 1" descr="Diagrama  O conteúdo gerado por IA pode estar incorreto.">
               <a:extLst xmlns:a="http://schemas.openxmlformats.org/drawingml/2006/main">
                 <a:ext uri="{FF2B5EF4-FFF2-40B4-BE49-F238E27FC236}">
                   <a16:creationId xmlns:a16="http://schemas.microsoft.com/office/drawing/2014/main" id="{3BD1FB96-5830-486A-ACDA-8A3CF735816B}"/>
@@ -1869,7 +1444,7 @@
               <a:graphicData uri="http://schemas.openxmlformats.org/drawingml/2006/picture">
                 <pic:pic xmlns:pic="http://schemas.openxmlformats.org/drawingml/2006/picture">
                   <pic:nvPicPr>
-                    <pic:cNvPr id="3" name="Imagem 1" descr="Diagrama&#10;&#10;O conteúdo gerado por IA pode estar incorreto.">
+                    <pic:cNvPr id="3" name="Imagem 1" descr="Diagrama  O conteúdo gerado por IA pode estar incorreto.">
                       <a:extLst>
                         <a:ext uri="{FF2B5EF4-FFF2-40B4-BE49-F238E27FC236}">
                           <a16:creationId xmlns:a16="http://schemas.microsoft.com/office/drawing/2014/main" id="{3BD1FB96-5830-486A-ACDA-8A3CF735816B}"/>
@@ -1946,23 +1521,8 @@
           <w:rFonts w:asciiTheme="minorHAnsi" w:hAnsiTheme="minorHAnsi" w:cstheme="minorHAnsi"/>
         </w:rPr>
         <w:t xml:space="preserve">Figura </w:t>
-      </w:r>
-      <w:r>
-        <w:rPr>
-          <w:rFonts w:asciiTheme="minorHAnsi" w:hAnsiTheme="minorHAnsi" w:cstheme="minorHAnsi"/>
-        </w:rPr>
         <w:fldChar w:fldCharType="begin"/>
-      </w:r>
-      <w:r>
-        <w:rPr>
-          <w:rFonts w:asciiTheme="minorHAnsi" w:hAnsiTheme="minorHAnsi" w:cstheme="minorHAnsi"/>
-        </w:rPr>
         <w:instrText xml:space="preserve"> SEQ Figura \* ARABIC </w:instrText>
-      </w:r>
-      <w:r>
-        <w:rPr>
-          <w:rFonts w:asciiTheme="minorHAnsi" w:hAnsiTheme="minorHAnsi" w:cstheme="minorHAnsi"/>
-        </w:rPr>
         <w:fldChar w:fldCharType="separate"/>
       </w:r>
       <w:r>
@@ -1983,19 +1543,7 @@
         <w:rPr>
           <w:rFonts w:asciiTheme="minorHAnsi" w:hAnsiTheme="minorHAnsi" w:cstheme="minorHAnsi"/>
         </w:rPr>
-        <w:t xml:space="preserve"> - </w:t>
-      </w:r>
-      <w:r>
-        <w:rPr>
-          <w:rFonts w:asciiTheme="minorHAnsi" w:hAnsiTheme="minorHAnsi" w:cstheme="minorHAnsi"/>
-        </w:rPr>
-        <w:t>E</w:t>
-      </w:r>
-      <w:r>
-        <w:rPr>
-          <w:rFonts w:asciiTheme="minorHAnsi" w:hAnsiTheme="minorHAnsi" w:cstheme="minorHAnsi"/>
-        </w:rPr>
-        <w:t>quipamento utilizado</w:t>
+        <w:t xml:space="preserve"> - Equipamento utilizado</w:t>
       </w:r>
     </w:p>
     <w:p>
@@ -2043,47 +1591,10 @@
         <w:rPr>
           <w:rFonts w:asciiTheme="minorHAnsi" w:hAnsiTheme="minorHAnsi" w:cstheme="minorHAnsi"/>
         </w:rPr>
-        <w:t>[[#croqui]]A seguir será apresentad</w:t>
-      </w:r>
-      <w:r>
-        <w:rPr>
-          <w:rFonts w:asciiTheme="minorHAnsi" w:hAnsiTheme="minorHAnsi" w:cstheme="minorHAnsi"/>
-        </w:rPr>
-        <w:t>o</w:t>
-      </w:r>
-      <w:r>
-        <w:rPr>
-          <w:rFonts w:asciiTheme="minorHAnsi" w:hAnsiTheme="minorHAnsi" w:cstheme="minorHAnsi"/>
-        </w:rPr>
-        <w:t xml:space="preserve"> na </w:t>
-      </w:r>
-      <w:r>
-        <w:rPr>
-          <w:rFonts w:asciiTheme="minorHAnsi" w:hAnsiTheme="minorHAnsi" w:cstheme="minorHAnsi"/>
-        </w:rPr>
+        <w:t xml:space="preserve">[[#croqui]]A seguir será apresentado na </w:t>
         <w:fldChar w:fldCharType="begin"/>
-      </w:r>
-      <w:r>
-        <w:rPr>
-          <w:rFonts w:asciiTheme="minorHAnsi" w:hAnsiTheme="minorHAnsi" w:cstheme="minorHAnsi"/>
-        </w:rPr>
         <w:instrText xml:space="preserve"> REF _Ref229497914 \h </w:instrText>
-      </w:r>
-      <w:r>
-        <w:rPr>
-          <w:rFonts w:asciiTheme="minorHAnsi" w:hAnsiTheme="minorHAnsi" w:cstheme="minorHAnsi"/>
-        </w:rPr>
-      </w:r>
-      <w:r>
-        <w:rPr>
-          <w:rFonts w:asciiTheme="minorHAnsi" w:hAnsiTheme="minorHAnsi" w:cstheme="minorHAnsi"/>
-        </w:rPr>
         <w:fldChar w:fldCharType="separate"/>
-      </w:r>
-      <w:r>
-        <w:rPr>
-          <w:rFonts w:asciiTheme="minorHAnsi" w:hAnsiTheme="minorHAnsi" w:cstheme="minorHAnsi"/>
-        </w:rPr>
         <w:t xml:space="preserve">Figura </w:t>
       </w:r>
       <w:r>
@@ -2098,11 +1609,6 @@
           <w:rFonts w:asciiTheme="minorHAnsi" w:hAnsiTheme="minorHAnsi" w:cstheme="minorHAnsi"/>
         </w:rPr>
         <w:fldChar w:fldCharType="end"/>
-      </w:r>
-      <w:r>
-        <w:rPr>
-          <w:rFonts w:asciiTheme="minorHAnsi" w:hAnsiTheme="minorHAnsi" w:cstheme="minorHAnsi"/>
-        </w:rPr>
         <w:t xml:space="preserve"> um croqui com indicação dos elementos ensaiados que foram nomeadas “</w:t>
       </w:r>
       <w:r>
@@ -2158,23 +1664,8 @@
           <w:rFonts w:asciiTheme="minorHAnsi" w:hAnsiTheme="minorHAnsi" w:cstheme="minorHAnsi"/>
         </w:rPr>
         <w:t xml:space="preserve">Figura </w:t>
-      </w:r>
-      <w:r>
-        <w:rPr>
-          <w:rFonts w:asciiTheme="minorHAnsi" w:hAnsiTheme="minorHAnsi" w:cstheme="minorHAnsi"/>
-        </w:rPr>
         <w:fldChar w:fldCharType="begin"/>
-      </w:r>
-      <w:r>
-        <w:rPr>
-          <w:rFonts w:asciiTheme="minorHAnsi" w:hAnsiTheme="minorHAnsi" w:cstheme="minorHAnsi"/>
-        </w:rPr>
         <w:instrText xml:space="preserve"> SEQ Figura \* ARABIC </w:instrText>
-      </w:r>
-      <w:r>
-        <w:rPr>
-          <w:rFonts w:asciiTheme="minorHAnsi" w:hAnsiTheme="minorHAnsi" w:cstheme="minorHAnsi"/>
-        </w:rPr>
         <w:fldChar w:fldCharType="separate"/>
       </w:r>
       <w:r>
@@ -2196,29 +1687,20 @@
         <w:rPr>
           <w:rFonts w:asciiTheme="minorHAnsi" w:hAnsiTheme="minorHAnsi" w:cstheme="minorHAnsi"/>
         </w:rPr>
-        <w:t xml:space="preserve"> </w:t>
-      </w:r>
-      <w:r>
+        <w:t xml:space="preserve"> – Indicação dos elementos ensaiados</w:t>
+      </w:r>
+    </w:p>
+    <w:p>
+      <w:pPr>
         <w:rPr>
           <w:rFonts w:asciiTheme="minorHAnsi" w:hAnsiTheme="minorHAnsi" w:cstheme="minorHAnsi"/>
-        </w:rPr>
-        <w:t>–</w:t>
-      </w:r>
+          <w:lang w:eastAsia="pt-BR"/>
+        </w:rPr>
+      </w:pPr>
       <w:r>
         <w:rPr>
           <w:rFonts w:asciiTheme="minorHAnsi" w:hAnsiTheme="minorHAnsi" w:cstheme="minorHAnsi"/>
-        </w:rPr>
-        <w:t xml:space="preserve"> </w:t>
-      </w:r>
-      <w:r>
-        <w:rPr>
-          <w:rFonts w:asciiTheme="minorHAnsi" w:hAnsiTheme="minorHAnsi" w:cstheme="minorHAnsi"/>
-        </w:rPr>
-        <w:t>Indicação dos elementos ensaiados</w:t>
-      </w:r>
-      <w:r>
-        <w:rPr>
-          <w:rFonts w:asciiTheme="minorHAnsi" w:hAnsiTheme="minorHAnsi" w:cstheme="minorHAnsi"/>
+          <w:lang w:eastAsia="pt-BR"/>
         </w:rPr>
         <w:t>[[/croqui]]</w:t>
       </w:r>
@@ -2363,23 +1845,8 @@
         </w:rPr>
         <w:lastRenderedPageBreak/>
         <w:t xml:space="preserve">Tabela </w:t>
-      </w:r>
-      <w:r>
-        <w:rPr>
-          <w:rFonts w:asciiTheme="minorHAnsi" w:hAnsiTheme="minorHAnsi" w:cstheme="minorHAnsi"/>
-        </w:rPr>
         <w:fldChar w:fldCharType="begin"/>
-      </w:r>
-      <w:r>
-        <w:rPr>
-          <w:rFonts w:asciiTheme="minorHAnsi" w:hAnsiTheme="minorHAnsi" w:cstheme="minorHAnsi"/>
-        </w:rPr>
         <w:instrText xml:space="preserve"> SEQ Tabela \* ARABIC </w:instrText>
-      </w:r>
-      <w:r>
-        <w:rPr>
-          <w:rFonts w:asciiTheme="minorHAnsi" w:hAnsiTheme="minorHAnsi" w:cstheme="minorHAnsi"/>
-        </w:rPr>
         <w:fldChar w:fldCharType="separate"/>
       </w:r>
       <w:r>
@@ -2394,11 +1861,6 @@
           <w:rFonts w:asciiTheme="minorHAnsi" w:hAnsiTheme="minorHAnsi" w:cstheme="minorHAnsi"/>
         </w:rPr>
         <w:fldChar w:fldCharType="end"/>
-      </w:r>
-      <w:r>
-        <w:rPr>
-          <w:rFonts w:asciiTheme="minorHAnsi" w:hAnsiTheme="minorHAnsi" w:cstheme="minorHAnsi"/>
-        </w:rPr>
         <w:t xml:space="preserve"> - Valores de resistividade elétrica indicativos da probabilidade de corrosão do concreto.</w:t>
       </w:r>
     </w:p>
@@ -2414,6 +1876,9 @@
         <w:gridCol w:w="3557"/>
       </w:tblGrid>
       <w:tr>
+        <w:trPr>
+          <w:cantSplit/>
+        </w:trPr>
         <w:tc>
           <w:tcPr>
             <w:tcW w:w="3231" w:type="pct"/>
@@ -2470,6 +1935,9 @@
         </w:tc>
       </w:tr>
       <w:tr>
+        <w:trPr>
+          <w:cantSplit/>
+        </w:trPr>
         <w:tc>
           <w:tcPr>
             <w:tcW w:w="1013" w:type="pct"/>
@@ -2542,6 +2010,9 @@
         </w:tc>
       </w:tr>
       <w:tr>
+        <w:trPr>
+          <w:cantSplit/>
+        </w:trPr>
         <w:tc>
           <w:tcPr>
             <w:tcW w:w="1013" w:type="pct"/>
@@ -2613,6 +2084,9 @@
         </w:tc>
       </w:tr>
       <w:tr>
+        <w:trPr>
+          <w:cantSplit/>
+        </w:trPr>
         <w:tc>
           <w:tcPr>
             <w:tcW w:w="1013" w:type="pct"/>
@@ -2684,6 +2158,9 @@
         </w:tc>
       </w:tr>
       <w:tr>
+        <w:trPr>
+          <w:cantSplit/>
+        </w:trPr>
         <w:tc>
           <w:tcPr>
             <w:tcW w:w="1013" w:type="pct"/>
@@ -2755,6 +2232,9 @@
         </w:tc>
       </w:tr>
       <w:tr>
+        <w:trPr>
+          <w:cantSplit/>
+        </w:trPr>
         <w:tc>
           <w:tcPr>
             <w:tcW w:w="1013" w:type="pct"/>
@@ -2826,6 +2306,9 @@
         </w:tc>
       </w:tr>
       <w:tr>
+        <w:trPr>
+          <w:cantSplit/>
+        </w:trPr>
         <w:tc>
           <w:tcPr>
             <w:tcW w:w="1013" w:type="pct"/>
@@ -3856,14 +3339,7 @@
           <w:rFonts w:asciiTheme="minorHAnsi" w:hAnsiTheme="minorHAnsi" w:cstheme="minorHAnsi"/>
           <w:lang w:eastAsia="pt-BR"/>
         </w:rPr>
-        <w:t xml:space="preserve">                                                       </w:t>
-      </w:r>
-      <w:r>
-        <w:rPr>
-          <w:rFonts w:asciiTheme="minorHAnsi" w:hAnsiTheme="minorHAnsi" w:cstheme="minorHAnsi"/>
-          <w:lang w:eastAsia="pt-BR"/>
-        </w:rPr>
-        <w:t>[[resp_assinatura]]</w:t>
+        <w:t xml:space="preserve">                                                       [[resp_assinatura]]</w:t>
       </w:r>
     </w:p>
     <w:tbl>
@@ -3910,13 +3386,6 @@
                 <w:i/>
               </w:rPr>
               <w:t>João Ribeiro de Carvalho</w:t>
-            </w:r>
-            <w:r>
-              <w:rPr>
-                <w:rFonts w:ascii="Calibri" w:hAnsi="Calibri"/>
-                <w:b/>
-                <w:i/>
-              </w:rPr>
               <w:br/>
             </w:r>
             <w:r>
@@ -3924,11 +3393,6 @@
                 <w:rFonts w:asciiTheme="minorHAnsi" w:hAnsiTheme="minorHAnsi" w:cstheme="minorHAnsi"/>
               </w:rPr>
               <w:t>Engenheiro Civil</w:t>
-            </w:r>
-            <w:r>
-              <w:rPr>
-                <w:rFonts w:asciiTheme="minorHAnsi" w:hAnsiTheme="minorHAnsi" w:cstheme="minorHAnsi"/>
-              </w:rPr>
               <w:br/>
               <w:t>CREA Nº49780 – PE</w:t>
             </w:r>
@@ -3976,11 +3440,6 @@
                 <w:rFonts w:asciiTheme="minorHAnsi" w:hAnsiTheme="minorHAnsi" w:cstheme="minorHAnsi"/>
               </w:rPr>
               <w:t>Engenheiro Civil</w:t>
-            </w:r>
-            <w:r>
-              <w:rPr>
-                <w:rFonts w:asciiTheme="minorHAnsi" w:hAnsiTheme="minorHAnsi" w:cstheme="minorHAnsi"/>
-              </w:rPr>
               <w:br/>
               <w:t>CREA Nº [[resp_crea]]</w:t>
             </w:r>
@@ -4245,7 +3704,7 @@
     <mc:AlternateContent>
       <mc:Choice Requires="v">
         <w:pict>
-          <v:shapetype w14:anchorId="0A0EF519" id="_x0000_t75" coordsize="21600,21600" o:spt="75" o:preferrelative="t" path="m@4@5l@4@11@9@11@9@5xe" filled="f" stroked="f">
+          <v:shapetype w14:anchorId="38B12487" id="_x0000_t75" coordsize="21600,21600" o:spt="75" o:preferrelative="t" path="m@4@5l@4@11@9@11@9@5xe" filled="f" stroked="f">
             <v:stroke joinstyle="miter"/>
             <v:formulas>
               <v:f eqn="if lineDrawn pixelLineWidth 0"/>
@@ -4264,17 +3723,17 @@
             <v:path o:extrusionok="f" gradientshapeok="t" o:connecttype="rect"/>
             <o:lock v:ext="edit" aspectratio="t"/>
           </v:shapetype>
-          <v:shape id="Imagem 1538604798" o:spid="_x0000_i1025" type="#_x0000_t75" style="width:189.15pt;height:195.6pt;visibility:visible;mso-wrap-style:square">
+          <v:shape id="Imagem 1096429683" o:spid="_x0000_i1025" type="#_x0000_t75" style="width:189.15pt;height:195.6pt;visibility:visible;mso-wrap-style:square">
             <v:imagedata r:id="rId1" o:title=""/>
           </v:shape>
         </w:pict>
       </mc:Choice>
       <mc:Fallback>
         <w:drawing>
-          <wp:inline distT="0" distB="0" distL="0" distR="0" wp14:anchorId="6AAC1179" wp14:editId="662741AC">
+          <wp:inline distT="0" distB="0" distL="0" distR="0" wp14:anchorId="07143848" wp14:editId="2DBFE345">
             <wp:extent cx="2402205" cy="2484120"/>
             <wp:effectExtent l="0" t="0" r="0" b="0"/>
-            <wp:docPr id="1538604798" name="Imagem 1538604798"/>
+            <wp:docPr id="1096429683" name="Imagem 1096429683"/>
             <wp:cNvGraphicFramePr>
               <a:graphicFrameLocks xmlns:a="http://schemas.openxmlformats.org/drawingml/2006/main" noChangeAspect="1"/>
             </wp:cNvGraphicFramePr>

</xml_diff>